<commit_message>
fix Lab 2 docs
</commit_message>
<xml_diff>
--- a/lab2-agile-backlog-sprint/docs/PES2UG24CS019_SE_Lab2.docx
+++ b/lab2-agile-backlog-sprint/docs/PES2UG24CS019_SE_Lab2.docx
@@ -102,6 +102,18 @@
           <w:szCs w:val="22"/>
         </w:rPr>
         <w:t xml:space="preserve">Domain: Healthcare and Telemedicine</w:t>
+      </w:r>
+    </w:p>
+    <w:p>
+      <w:pPr>
+        <w:spacing w:after="200"/>
+      </w:pPr>
+      <w:r>
+        <w:rPr>
+          <w:sz w:val="22"/>
+          <w:szCs w:val="22"/>
+        </w:rPr>
+        <w:t xml:space="preserve">Lab 1 produced five functional and two non functional requirements for this system. This lab turns those into a Jira backlog and runs it through two sprints. The Scrum space VCDSS holds five epics, seventeen user stories and 101 story points. Both sprints were one week long and carried 40 points.</w:t>
       </w:r>
     </w:p>
     <w:p>
@@ -117,7 +129,7 @@
           <w:sz w:val="26"/>
           <w:szCs w:val="26"/>
         </w:rPr>
-        <w:t xml:space="preserve">1. What was done</w:t>
+        <w:t xml:space="preserve">1. Epics and user stories</w:t>
       </w:r>
     </w:p>
     <w:p>
@@ -129,47 +141,7 @@
           <w:sz w:val="22"/>
           <w:szCs w:val="22"/>
         </w:rPr>
-        <w:t xml:space="preserve">In Lab 1 I wrote five functional and two non functional requirements for this system, together with a use case model. This lab takes those same requirements and turns them into an agile backlog in Jira, then runs the backlog through two sprints.</w:t>
-      </w:r>
-    </w:p>
-    <w:p>
-      <w:pPr>
-        <w:spacing w:after="160"/>
-      </w:pPr>
-      <w:r>
-        <w:rPr>
-          <w:sz w:val="22"/>
-          <w:szCs w:val="22"/>
-        </w:rPr>
-        <w:t xml:space="preserve">The Jira space is a Scrum space with the key VCDSS. The backlog holds five epics, seventeen user stories and 101 story points. Two sprints of 40 points each were planned, started and completed. Three stories worth 21 points were left in the backlog on purpose.</w:t>
-      </w:r>
-    </w:p>
-    <w:p>
-      <w:pPr>
-        <w:pStyle w:val="Heading1"/>
-        <w:spacing w:after="140" w:before="320"/>
-      </w:pPr>
-      <w:r>
-        <w:rPr>
-          <w:b/>
-          <w:bCs/>
-          <w:color w:val="333333"/>
-          <w:sz w:val="26"/>
-          <w:szCs w:val="26"/>
-        </w:rPr>
-        <w:t xml:space="preserve">2. Epics and user stories</w:t>
-      </w:r>
-    </w:p>
-    <w:p>
-      <w:pPr>
-        <w:spacing w:after="160"/>
-      </w:pPr>
-      <w:r>
-        <w:rPr>
-          <w:sz w:val="22"/>
-          <w:szCs w:val="22"/>
-        </w:rPr>
-        <w:t xml:space="preserve">The requirements were grouped into five epics. Each epic is a stretch of the citizen journey that could be demonstrated on its own. I did not make one epic per requirement, because FR-001 and FR-003 both happen inside the same booking screen and separating them would have produced two epics that nobody could show separately.</w:t>
+        <w:t xml:space="preserve">The requirements were grouped into five epics, each one a stretch of the citizen journey that could be demonstrated on its own, rather than one epic per requirement.</w:t>
       </w:r>
     </w:p>
     <w:tbl>
@@ -933,7 +905,7 @@
           <w:sz w:val="22"/>
           <w:szCs w:val="22"/>
         </w:rPr>
-        <w:t xml:space="preserve">The seventeen stories are listed below in the As a, I want, So that form. The full text of each one is in the description field of the matching Jira work item.</w:t>
+        <w:t xml:space="preserve">The seventeen stories are below. The full As a, I want, So that text sits in the description field of each Jira work item.</w:t>
       </w:r>
     </w:p>
     <w:tbl>
@@ -2566,7 +2538,7 @@
           <w:sz w:val="26"/>
           <w:szCs w:val="26"/>
         </w:rPr>
-        <w:t xml:space="preserve">3. Story point estimation</w:t>
+        <w:t xml:space="preserve">2. Story point estimation</w:t>
       </w:r>
     </w:p>
     <w:p>
@@ -2578,19 +2550,7 @@
           <w:sz w:val="22"/>
           <w:szCs w:val="22"/>
         </w:rPr>
-        <w:t xml:space="preserve">Estimates use the Fibonacci scale as described in the handout. I used the story Declare age, occupation and health condition as the anchor at 3 points, since it is a plain form with validation and there is nothing unknown about it, and sized the rest against that.</w:t>
-      </w:r>
-    </w:p>
-    <w:p>
-      <w:pPr>
-        <w:spacing w:after="160"/>
-      </w:pPr>
-      <w:r>
-        <w:rPr>
-          <w:sz w:val="22"/>
-          <w:szCs w:val="22"/>
-        </w:rPr>
-        <w:t xml:space="preserve">The largest estimate is 13 points, given to verifying a certificate QR offline. That number is carrying uncertainty rather than volume of work, which is discussed further in the reflection.</w:t>
+        <w:t xml:space="preserve">Estimates use the Fibonacci scale. Declare age, occupation and health condition was the anchor at 3 points, since it is a plain form with nothing unknown about it, and the rest were sized against it. The largest is 13, for offline QR verification, which carries uncertainty rather than volume of work.</w:t>
       </w:r>
     </w:p>
     <w:p>
@@ -2668,7 +2628,7 @@
           <w:sz w:val="26"/>
           <w:szCs w:val="26"/>
         </w:rPr>
-        <w:t xml:space="preserve">4. Sprint 1</w:t>
+        <w:t xml:space="preserve">3. Sprint 1</w:t>
       </w:r>
     </w:p>
     <w:p>
@@ -3498,7 +3458,7 @@
           <w:sz w:val="22"/>
           <w:szCs w:val="22"/>
         </w:rPr>
-        <w:t xml:space="preserve">The two administrator stories are at the top on purpose. The system cannot enforce a dose gap that nobody has configured yet, so setting the cohort rules has to be finished before the blocking story, and setting capacity before the capacity story. They look like ordinary settings screens but they are really dependencies, and I kept that order when moving the cards as well.</w:t>
+        <w:t xml:space="preserve">The two administrator stories are at the top on purpose. The system cannot enforce a dose gap that nobody has configured, so they are dependencies rather than ordinary settings screens.</w:t>
       </w:r>
     </w:p>
     <w:p>
@@ -3576,7 +3536,7 @@
           <w:sz w:val="26"/>
           <w:szCs w:val="26"/>
         </w:rPr>
-        <w:t xml:space="preserve">5. Sprint 2</w:t>
+        <w:t xml:space="preserve">4. Sprint 2</w:t>
       </w:r>
     </w:p>
     <w:p>
@@ -4252,7 +4212,7 @@
           <w:sz w:val="22"/>
           <w:szCs w:val="22"/>
         </w:rPr>
-        <w:t xml:space="preserve">The same dependency thinking applies here. The dose record is what triggers the certificate, so recording had to be finished before issuing made any sense.</w:t>
+        <w:t xml:space="preserve">The dose record is what triggers the certificate, so recording had to be finished before issuing made any sense.</w:t>
       </w:r>
     </w:p>
     <w:p>
@@ -4330,7 +4290,7 @@
           <w:sz w:val="26"/>
           <w:szCs w:val="26"/>
         </w:rPr>
-        <w:t xml:space="preserve">6. Stories left in the backlog</w:t>
+        <w:t xml:space="preserve">5. Stories left in the backlog</w:t>
       </w:r>
     </w:p>
     <w:p>
@@ -4342,7 +4302,7 @@
           <w:sz w:val="22"/>
           <w:szCs w:val="22"/>
         </w:rPr>
-        <w:t xml:space="preserve">Not everything was sprinted. These three were left alone, which is closer to how a real sprint ends than a backlog that empties perfectly.</w:t>
+        <w:t xml:space="preserve">These three were left alone, which is closer to how a real sprint ends than a backlog that empties perfectly.</w:t>
       </w:r>
     </w:p>
     <w:tbl>
@@ -4588,7 +4548,7 @@
           <w:sz w:val="26"/>
           <w:szCs w:val="26"/>
         </w:rPr>
-        <w:t xml:space="preserve">7. Burndown charts</w:t>
+        <w:t xml:space="preserve">6. Burndown charts</w:t>
       </w:r>
     </w:p>
     <w:p>
@@ -4600,7 +4560,7 @@
           <w:sz w:val="22"/>
           <w:szCs w:val="22"/>
         </w:rPr>
-        <w:t xml:space="preserve">Both sprints produce the same shape. The red remaining line sits at zero for most of the sprint, rises sharply to 40, and then falls back to zero. The grey guideline runs underneath. The event table below each chart explains it: every row reads Scope change, issue added to sprint, and the status report marks every story with an asterisk for issue added to sprint after start time.</w:t>
+        <w:t xml:space="preserve">Both sprints give the same shape. The red remaining line sits at zero, rises sharply to 40, then falls back. Every row of the event table reads Scope change, issue added to sprint.</w:t>
       </w:r>
     </w:p>
     <w:p>
@@ -4612,7 +4572,7 @@
           <w:sz w:val="22"/>
           <w:szCs w:val="22"/>
         </w:rPr>
-        <w:t xml:space="preserve">The reason is that the sprints were given backdated start dates so the chart would have more than one day on its horizontal axis, but the stories were only created and added later. Jira therefore recorded each sprint as starting with zero points and then receiving all 40 as scope change. What the chart is really showing is scope arriving in a sprint that began empty.</w:t>
+        <w:t xml:space="preserve">The sprints were given backdated start dates so the chart would have more than one day on its axis, but the stories were added later. Jira therefore recorded each sprint as starting empty and then receiving all 40 as scope change.</w:t>
       </w:r>
     </w:p>
     <w:p>
@@ -4752,7 +4712,7 @@
           <w:sz w:val="26"/>
           <w:szCs w:val="26"/>
         </w:rPr>
-        <w:t xml:space="preserve">8. Sprint reports</w:t>
+        <w:t xml:space="preserve">7. Sprint reports</w:t>
       </w:r>
     </w:p>
     <w:p>
@@ -4764,7 +4724,7 @@
           <w:sz w:val="22"/>
           <w:szCs w:val="22"/>
         </w:rPr>
-        <w:t xml:space="preserve">The sprint reports confirm that both sprints closed at 40 of 40 points with nothing pushed back to the backlog.</w:t>
+        <w:t xml:space="preserve">Both sprints closed at 40 of 40 points with nothing pushed back to the backlog.</w:t>
       </w:r>
     </w:p>
     <w:p>
@@ -4904,7 +4864,7 @@
           <w:sz w:val="26"/>
           <w:szCs w:val="26"/>
         </w:rPr>
-        <w:t xml:space="preserve">9. Reflection</w:t>
+        <w:t xml:space="preserve">8. Reflection</w:t>
       </w:r>
     </w:p>
     <w:p>
@@ -4931,7 +4891,7 @@
           <w:sz w:val="22"/>
           <w:szCs w:val="22"/>
         </w:rPr>
-        <w:t xml:space="preserve">This exercise cannot really answer that. Nothing was built, so there is no actual effort to compare against, and both sprints closed at 40 of 40 only because I moved the cards. Saying the estimates were accurate would be inventing a result.</w:t>
+        <w:t xml:space="preserve">This exercise cannot really answer that. Nothing was built, so there is no actual effort to compare against, and both sprints closed at 40 of 40 only because I moved the cards.</w:t>
       </w:r>
     </w:p>
     <w:p>
@@ -4943,7 +4903,7 @@
           <w:sz w:val="22"/>
           <w:szCs w:val="22"/>
         </w:rPr>
-        <w:t xml:space="preserve">What I can say is which ones I would change. The 13 points on offline QR verification were carrying my uncertainty rather than the work, because verifying offline means getting the Certificate Authority public key onto every device at every centre and rotating it when it changes, which is a distribution problem more than a coding one. Splitting it into an online check and a separate key distribution story would have given two honest estimates instead of one large number hiding a question I never answered. The 8 points on cohort assignment is probably too high, since the rule itself is a lookup and the hard part, agreeing what the cohorts are, sits in a different story in the same sprint.</w:t>
+        <w:t xml:space="preserve">What I can say is which ones I would change. The 13 on offline QR verification was carrying my uncertainty rather than the work, since it means getting the Certificate Authority key onto every device and rotating it, which is a distribution problem more than a coding one. Splitting it in two would have given two honest estimates instead of one large number hiding a question I never answered. The 8 on cohort assignment is too high, because the rule is a lookup and the hard part sits in a different story.</w:t>
       </w:r>
     </w:p>
     <w:p>
@@ -4970,7 +4930,7 @@
           <w:sz w:val="22"/>
           <w:szCs w:val="22"/>
         </w:rPr>
-        <w:t xml:space="preserve">Mostly. Priority was set by user impact, and in a vaccination rollout impact means medical safety before convenience. So the dose gap story, the capacity story and the duplicate record story are all High even though no citizen would ask for them. They are the rules that stop the system doing harm. Showing the earliest eligible date and rescheduling sit at Medium.</w:t>
+        <w:t xml:space="preserve">Mostly. Priority was set by user impact, and here impact means medical safety before convenience. The dose gap, capacity and duplicate record stories are all High even though no citizen would ask for them, because they are the rules that stop the system doing harm.</w:t>
       </w:r>
     </w:p>
     <w:p>
@@ -4982,7 +4942,7 @@
           <w:sz w:val="22"/>
           <w:szCs w:val="22"/>
         </w:rPr>
-        <w:t xml:space="preserve">The part I am less happy with is logging an adverse event, which I marked Low and then dropped from both sprints. That follows from the use case model, since UC-10 only extends UC-04, but in a real rollout a reaction that never gets logged is a patient safety gap. It is Low because it is optional to the flow, not because it does not matter.</w:t>
+        <w:t xml:space="preserve">The part I am less happy with is logging an adverse event, marked Low and dropped from both sprints. That follows from UC-10 only extending UC-04, but a reaction that never gets logged is a patient safety gap. It is Low because it is optional to the flow, not because it does not matter.</w:t>
       </w:r>
     </w:p>
     <w:p>
@@ -5009,7 +4969,7 @@
           <w:sz w:val="22"/>
           <w:szCs w:val="22"/>
         </w:rPr>
-        <w:t xml:space="preserve">On paper it matched exactly, both sprints planned at 40 and closed at 40 with nothing carried over. That is not evidence of good planning. It is what happens when one person drags every card across in a single sitting and nothing can slip.</w:t>
+        <w:t xml:space="preserve">On paper it matched exactly, both sprints planned at 40 and closed at 40. That is not evidence of good planning. It is what happens when one person drags every card across in a single sitting and nothing can slip.</w:t>
       </w:r>
     </w:p>
     <w:p>
@@ -5021,7 +4981,7 @@
           <w:sz w:val="22"/>
           <w:szCs w:val="22"/>
         </w:rPr>
-        <w:t xml:space="preserve">Two things did go wrong. First, I changed statuses from the backlog rows before starting the sprint, assuming that dragging stories into the sprint container had started it. It had not, the board was still empty, and Jira records nothing in a burndown before a sprint is actually started, so I had to set those stories back to To Do and redo the transitions on the board. Second, the backdated start dates did not line up with when the stories were added, which is what produced the odd burndown shape. Backdating only helps if the stories are already in the sprint at that time.</w:t>
+        <w:t xml:space="preserve">Two things did go wrong. I changed statuses from the backlog rows before starting the sprint, assuming that dragging stories in had started it. It had not, and Jira records nothing in a burndown before a sprint starts, so I reset those stories and redid the moves on the board. The backdated start dates also did not line up with when the stories were added, which produced the odd burndown shape.</w:t>
       </w:r>
     </w:p>
     <w:p>
@@ -5033,7 +4993,7 @@
           <w:sz w:val="22"/>
           <w:szCs w:val="22"/>
         </w:rPr>
-        <w:t xml:space="preserve">The sprint goals held up better. Sprint 1 delivers one connected slice rather than a scatter of half finished features, and Sprint 2 finishes the journey through to a verifiable certificate. Either one could have been demonstrated on its own.</w:t>
+        <w:t xml:space="preserve">The sprint goals held up better. Sprint 1 delivers one connected slice rather than a scatter of half finished features, and Sprint 2 finishes the journey to a verifiable certificate.</w:t>
       </w:r>
     </w:p>
     <w:p>
@@ -5060,7 +5020,7 @@
           <w:sz w:val="22"/>
           <w:szCs w:val="22"/>
         </w:rPr>
-        <w:t xml:space="preserve">Read as a shape rather than as a record of my clicking, the chart says work arrived after the sprint began and was then finished in one lump. The handout notes that a sharp drop suggests work was not estimated accurately or broken down properly, and that burndowns are useful for spotting scope creep. Both readings fit. A team whose chart looked like this would be committing to work after the sprint had started, and the 13 point story is exactly the kind of item that causes the second problem for real.</w:t>
+        <w:t xml:space="preserve">Read as a shape rather than a record of my clicking, it says work arrived after the sprint began and was finished in one lump. The handout notes that a sharp drop suggests work was not estimated or broken down properly, and that burndowns show scope creep. Both fit, and the 13 point story is the kind of item that causes the first for real.</w:t>
       </w:r>
     </w:p>
     <w:p>
@@ -5072,7 +5032,7 @@
           <w:sz w:val="22"/>
           <w:szCs w:val="22"/>
         </w:rPr>
-        <w:t xml:space="preserve">On capacity, two sprints is nowhere near enough to claim a velocity, and these two are worth even less because the completions are simulated. Forty points a sprint is a starting assumption, not a measured number, and it would take three or four sprints of real data before it could be used to forecast anything. The one honest signal is that 21 points were left in the backlog rather than pulled forward to make the numbers look complete, which is a better decision than overcommitting and carrying spillover into the next sprint.</w:t>
+        <w:t xml:space="preserve">Two sprints is nowhere near enough to claim a velocity, and these two are worth less still because the completions are simulated. Forty points a sprint is a starting assumption, not a measured number. The one honest signal is that 21 points were left in the backlog rather than pulled forward to make the numbers look complete.</w:t>
       </w:r>
     </w:p>
     <w:sectPr>

</xml_diff>